<commit_message>
Add contact email to EN/RU portfolio and resumes
</commit_message>
<xml_diff>
--- a/grigorii-eleskin-resume-ru.docx
+++ b/grigorii-eleskin-resume-ru.docx
@@ -35,12 +35,19 @@
     <w:p>
       <w:hyperlink r:id="rId2">
         <w:r>
+          <w:t xml:space="preserve">nyarumilian@gmail.com: mailto:nyarumilian@gmail.com</w:t>
+        </w:r>
+      </w:hyperlink>
+    </w:p>
+    <w:p>
+      <w:hyperlink r:id="rId3">
+        <w:r>
           <w:t xml:space="preserve">GitHub: https://github.com/Nyarum</w:t>
         </w:r>
       </w:hyperlink>
     </w:p>
     <w:p>
-      <w:hyperlink r:id="rId3">
+      <w:hyperlink r:id="rId4">
         <w:r>
           <w:t xml:space="preserve">Telegram: https://t.me/golovatskiii</w:t>
         </w:r>

</xml_diff>

<commit_message>
Update work experience descriptions in English and Russian
</commit_message>
<xml_diff>
--- a/grigorii-eleskin-resume-ru.docx
+++ b/grigorii-eleskin-resume-ru.docx
@@ -114,27 +114,37 @@
     </w:p>
     <w:p>
       <w:r>
-        <w:t xml:space="preserve">• Спроектировал распределение состояния между сервисами с использованием NATS и Redis с учётом согласованности, отказоустойчивости и риска потери состояния в распределённых компонентах.</w:t>
-      </w:r>
-    </w:p>
-    <w:p>
-      <w:r>
-        <w:t xml:space="preserve">• Разработал интеграции с несколькими провайдерами blockchain RPC с учётом задержек, сбоев и ограничений конкретных провайдеров.</w:t>
-      </w:r>
-    </w:p>
-    <w:p>
-      <w:r>
-        <w:t xml:space="preserve">• Разрабатывал, изменял и развёртывал смарт-контракты на Solidity, в том числе объединял несколько операций для сокращения количества отдельных запросов в блокчейн.</w:t>
-      </w:r>
-    </w:p>
-    <w:p>
-      <w:r>
-        <w:t xml:space="preserve">• Выявлял и устранял узкие места по задержкам, CPU и памяти с помощью распределённой трассировки и профилирования в Grafana, Tempo и Pyroscope.</w:t>
-      </w:r>
-    </w:p>
-    <w:p>
-      <w:r>
-        <w:t xml:space="preserve">• Отвечал за доставку сервисов и эксплуатацию в production с Kubernetes и Helm, включая развёртывание, конфигурацию, масштабирование, наблюдаемость и анализ производительности.</w:t>
+        <w:t xml:space="preserve">• Интегрировал новые DEX-протоколы в Pathfinder, расширяя покрытие торговых пар и улучшая доступные курсы обмена.</w:t>
+      </w:r>
+    </w:p>
+    <w:p>
+      <w:r>
+        <w:t xml:space="preserve">• Поддерживал интеграции при изменениях API и адресов контрактов, взаимодействовал с разработчиками DEX-протоколов.</w:t>
+      </w:r>
+    </w:p>
+    <w:p>
+      <w:r>
+        <w:t xml:space="preserve">• Анализировал обращения поддержки и production-инциденты, связанные с маршрутизацией и интеграциями протоколов.</w:t>
+      </w:r>
+    </w:p>
+    <w:p>
+      <w:r>
+        <w:t xml:space="preserve">• Разрабатывал интеграционные тесты для реальных сценариев обмена, используя Tenderly и blockchain RPC-провайдеров.</w:t>
+      </w:r>
+    </w:p>
+    <w:p>
+      <w:r>
+        <w:t xml:space="preserve">• Проектировал и поддерживал процессы развёртывания сервисов в staging и production.</w:t>
+      </w:r>
+    </w:p>
+    <w:p>
+      <w:r>
+        <w:t xml:space="preserve">• Участвовал в архитектуре новых функций и миграции с HTTP на NATS, упростив горизонтальное масштабирование сервисов.</w:t>
+      </w:r>
+    </w:p>
+    <w:p>
+      <w:r>
+        <w:t xml:space="preserve">• Технологии: Golang, Typescript, NATS, Redis, Blockchain, gRPC, Protobuf, Clickhouse</w:t>
       </w:r>
     </w:p>
     <w:p>
@@ -157,32 +167,32 @@
     </w:p>
     <w:p>
       <w:r>
-        <w:t xml:space="preserve">• Проектировал и разрабатывал backend для многопользовательских игровых функций в реальном времени, включая комнаты и лобби, с акцентом на надёжность и горизонтальное масштабирование.</w:t>
-      </w:r>
-    </w:p>
-    <w:p>
-      <w:r>
-        <w:t xml:space="preserve">• Разрабатывал масштабируемые микросервисы для растущего числа одновременно играющих пользователей и распределения нагрузки между несколькими экземплярами сервисов.</w:t>
-      </w:r>
-    </w:p>
-    <w:p>
-      <w:r>
-        <w:t xml:space="preserve">• Проектировал ETL-конвейеры и распределение данных, чтобы переносить нагрузку с единственной базы PostgreSQL и направлять данные в хранилища, оптимизированные под конкретные сценарии доступа, включая PostgreSQL, ClickHouse и Redis.</w:t>
-      </w:r>
-    </w:p>
-    <w:p>
-      <w:r>
-        <w:t xml:space="preserve">• Проектировал архитектуры обработки данных с высокой интенсивностью записи, используя секционирование таблиц, шардинг и разделение нагрузок для сохранения производительности баз при росте объёмов данных и трафика.</w:t>
-      </w:r>
-    </w:p>
-    <w:p>
-      <w:r>
-        <w:t xml:space="preserve">• Разрабатывал и масштабировал WebSocket-инфраструктуру для большого числа одновременных соединений, используя брокеры сообщений для распределения событий и коммуникации между несколькими backend-экземплярами.</w:t>
-      </w:r>
-    </w:p>
-    <w:p>
-      <w:r>
-        <w:t xml:space="preserve">• Работал над полным жизненным циклом backend-функций: от продуктовых требований и архитектуры до реализации, масштабирования, развёртывания и надёжности в production.</w:t>
+        <w:t xml:space="preserve">• Разрабатывал backend на Go для многопользовательских функций реального времени, включая комнаты и лобби. Участвовал в полном цикле: от продуктовых требований и архитектуры до реализации и поддержки в production.</w:t>
+      </w:r>
+    </w:p>
+    <w:p>
+      <w:r>
+        <w:t xml:space="preserve">• Проектировал микросервисы с горизонтальным масштабированием и распределением нагрузки между экземплярами.</w:t>
+      </w:r>
+    </w:p>
+    <w:p>
+      <w:r>
+        <w:t xml:space="preserve">• Разрабатывал WebSocket-инфраструктуру; использовал брокеры сообщений для передачи событий между backend-экземплярами.</w:t>
+      </w:r>
+    </w:p>
+    <w:p>
+      <w:r>
+        <w:t xml:space="preserve">• Проектировал ETL-конвейеры и распределение данных между PostgreSQL, ClickHouse и Redis в зависимости от сценариев доступа, снижая нагрузку на основную PostgreSQL.</w:t>
+      </w:r>
+    </w:p>
+    <w:p>
+      <w:r>
+        <w:t xml:space="preserve">• Для систем с интенсивной записью применял секционирование таблиц, распределение данных между узлами (шардинг) и разделение нагрузок, выбирая подход под конкретный сценарий доступа.</w:t>
+      </w:r>
+    </w:p>
+    <w:p>
+      <w:r>
+        <w:t xml:space="preserve">• Технологии: Golang, PostgreSQL, Clickhouse, AWS, Redis</w:t>
       </w:r>
     </w:p>
     <w:p>
@@ -205,12 +215,7 @@
     </w:p>
     <w:p>
       <w:r>
-        <w:t xml:space="preserve">• Разрабатывал backend-функциональность на Go для платформы анализа поведения пользователей.</w:t>
-      </w:r>
-    </w:p>
-    <w:p>
-      <w:r>
-        <w:t xml:space="preserve">• Интегрировал новые аналитические функции в существующий backend, расширяя возможности платформы.</w:t>
+        <w:t xml:space="preserve">• Разрабатывал backend на Go для платформы анализа поведения пользователей, интегрировал новые аналитические функции.</w:t>
       </w:r>
     </w:p>
     <w:p>
@@ -220,12 +225,7 @@
     </w:p>
     <w:p>
       <w:r>
-        <w:t xml:space="preserve">• Внедрял пайплайны Terraform для изменения инфраструктуры, совмещая эту работу с разработкой приложения.</w:t>
-      </w:r>
-    </w:p>
-    <w:p>
-      <w:r>
-        <w:t xml:space="preserve">• Поддерживал кластеры AWS, на которых работали аналитическая платформа и её backend-сервисы.</w:t>
+        <w:t xml:space="preserve">• Внедрял Terraform-пайплайны для изменения инфраструктуры и поддерживал AWS-кластеры платформы.</w:t>
       </w:r>
     </w:p>
     <w:p>
@@ -248,22 +248,17 @@
     </w:p>
     <w:p>
       <w:r>
-        <w:t xml:space="preserve">• Руководил backend-командой, разрабатывавшей новые функции для проектов внешних клиентов.</w:t>
-      </w:r>
-    </w:p>
-    <w:p>
-      <w:r>
-        <w:t xml:space="preserve">• Организовывал разработку с помощью гибких практик, координируя выпуск новых функций и поддержку существующих.</w:t>
-      </w:r>
-    </w:p>
-    <w:p>
-      <w:r>
-        <w:t xml:space="preserve">• Совмещал техническое руководство с практической разработкой backend-функциональности клиентских приложений. Улучшал архитектуру существующих backend-систем в проектах нескольких клиентов.</w:t>
-      </w:r>
-    </w:p>
-    <w:p>
-      <w:r>
-        <w:t xml:space="preserve">• Проводил рефакторинг существующей функциональности в рамках развития и поддержки backend.</w:t>
+        <w:t xml:space="preserve">• Руководил backend-командой, разрабатывавшей и поддерживавшей проекты внешних клиентов.</w:t>
+      </w:r>
+    </w:p>
+    <w:p>
+      <w:r>
+        <w:t xml:space="preserve">• Совмещал организацию разработки с реализацией backend-функций.</w:t>
+      </w:r>
+    </w:p>
+    <w:p>
+      <w:r>
+        <w:t xml:space="preserve">• Улучшал архитектуру и проводил рефакторинг существующих систем.</w:t>
       </w:r>
     </w:p>
     <w:p>
@@ -286,22 +281,17 @@
     </w:p>
     <w:p>
       <w:r>
-        <w:t xml:space="preserve">• Разрабатывал микросервисы платформы игровой аналитики, реализуя backend для её аналитических функций.</w:t>
-      </w:r>
-    </w:p>
-    <w:p>
-      <w:r>
-        <w:t xml:space="preserve">• Работал над протоколом взаимодействия с CS:GO в рамках разработки игровой backend-функциональности.</w:t>
-      </w:r>
-    </w:p>
-    <w:p>
-      <w:r>
-        <w:t xml:space="preserve">• Внедрил бета-решение для аналитики CS:GO, расширив возможности платформы для этой игры. Разбирал технические проблемы в аналитическом backend и помогал команде находить решения.</w:t>
-      </w:r>
-    </w:p>
-    <w:p>
-      <w:r>
-        <w:t xml:space="preserve">• Поддерживал стабильность backend-сервисов наряду с разработкой микросервисов и аналитики CS:GO.</w:t>
+        <w:t xml:space="preserve">• Разрабатывал и поддерживал микросервисы платформы игровой аналитики.</w:t>
+      </w:r>
+    </w:p>
+    <w:p>
+      <w:r>
+        <w:t xml:space="preserve">• Работал над протоколом взаимодействия с CS:GO и внедрил бета-решение для аналитики этой игры.</w:t>
+      </w:r>
+    </w:p>
+    <w:p>
+      <w:r>
+        <w:t xml:space="preserve">• Исследовал технические проблемы и обеспечивал стабильность backend-сервисов.</w:t>
       </w:r>
     </w:p>
     <w:p>
@@ -324,27 +314,7 @@
     </w:p>
     <w:p>
       <w:r>
-        <w:t xml:space="preserve">• Разрабатывал программную функциональность для внешних клиентов, превращая бизнес-требования в работающие возможности приложений.</w:t>
-      </w:r>
-    </w:p>
-    <w:p>
-      <w:r>
-        <w:t xml:space="preserve">• Прорабатывал клиентские требования на уровне реализации, связывая бизнес-задачи с конкретным поведением приложения.</w:t>
-      </w:r>
-    </w:p>
-    <w:p>
-      <w:r>
-        <w:t xml:space="preserve">• Реализовывал логику приложений с учётом рабочих процессов и бизнес-правил конкретных клиентов.</w:t>
-      </w:r>
-    </w:p>
-    <w:p>
-      <w:r>
-        <w:t xml:space="preserve">• Интегрировал изменения функциональности в клиентские приложения в рамках аутсорс-разработки.</w:t>
-      </w:r>
-    </w:p>
-    <w:p>
-      <w:r>
-        <w:t xml:space="preserve">• Дорабатывал реализацию функций с опорой на бизнес-требования, согласуя поведение приложений с потребностями клиентов.</w:t>
+        <w:t xml:space="preserve">• Разрабатывал приложения для внешних клиентов: переводил бизнес-требования в программную логику и интегрировал новую функциональность.</w:t>
       </w:r>
     </w:p>
     <w:p>
@@ -367,22 +337,7 @@
     </w:p>
     <w:p>
       <w:r>
-        <w:t xml:space="preserve">• Разрабатывал backend на Go, участвуя в реализации серверной части приложения. Реализовывал бизнес-логику, преобразуя требования к приложению в конкретное поведение backend.</w:t>
-      </w:r>
-    </w:p>
-    <w:p>
-      <w:r>
-        <w:t xml:space="preserve">• Работал над backend-компонентами, отвечавшими за применение бизнес-правил в процессах приложения.</w:t>
-      </w:r>
-    </w:p>
-    <w:p>
-      <w:r>
-        <w:t xml:space="preserve">• Связывал реализацию бизнес-логики с остальной backend-функциональностью при разработке возможностей приложения.</w:t>
-      </w:r>
-    </w:p>
-    <w:p>
-      <w:r>
-        <w:t xml:space="preserve">• Дорабатывал backend-код, чтобы поведение приложения соответствовало требованиям к бизнес-логике.</w:t>
+        <w:t xml:space="preserve">• Разрабатывал backend на Go и реализовывал бизнес-логику приложения.</w:t>
       </w:r>
     </w:p>
     <w:p>
@@ -405,27 +360,7 @@
     </w:p>
     <w:p>
       <w:r>
-        <w:t xml:space="preserve">• Разработал CLI-утилиту на Go для сервиса Iron, предоставив доступ к его функциям из терминала.</w:t>
-      </w:r>
-    </w:p>
-    <w:p>
-      <w:r>
-        <w:t xml:space="preserve">• Реализовывал поведение команд для взаимодействия с Iron, связывая действия в CLI с возможностями сервиса.</w:t>
-      </w:r>
-    </w:p>
-    <w:p>
-      <w:r>
-        <w:t xml:space="preserve">• Работал над пользовательскими сценариями CLI, уделяя внимание понятному взаимодействию из терминала.</w:t>
-      </w:r>
-    </w:p>
-    <w:p>
-      <w:r>
-        <w:t xml:space="preserve">• Улучшал удобство CLI, дорабатывая способы обращения к функциям утилиты.</w:t>
-      </w:r>
-    </w:p>
-    <w:p>
-      <w:r>
-        <w:t xml:space="preserve">• Дорабатывал сценарии командной строки, повышая эффективность повседневной работы с сервисом Iron.</w:t>
+        <w:t xml:space="preserve">• Разработал CLI-утилиту на Go для взаимодействия с сервисом Iron; дорабатывал команды и пользовательские сценарии.</w:t>
       </w:r>
     </w:p>
     <w:p>

</xml_diff>

<commit_message>
Refresh profile summary and expanded 1inch experience in EN and RU
</commit_message>
<xml_diff>
--- a/grigorii-eleskin-resume-ru.docx
+++ b/grigorii-eleskin-resume-ru.docx
@@ -12,7 +12,7 @@
     </w:p>
     <w:p>
       <w:r>
-        <w:t xml:space="preserve">Старший backend-инженер</w:t>
+        <w:t xml:space="preserve">Старший инженер-программист</w:t>
       </w:r>
     </w:p>
     <w:p>
@@ -63,27 +63,77 @@
     </w:p>
     <w:p>
       <w:r>
-        <w:t xml:space="preserve">Старший backend-инженер с опытом более 10 лет в разработке и эксплуатации production-систем, преимущественно на Go.</w:t>
-      </w:r>
-    </w:p>
-    <w:p>
-      <w:r>
-        <w:t xml:space="preserve">Мой опыт охватывает блокчейн-инфраструктуру, многопользовательские игры в реальном времени и аналитику поведения пользователей. Разрабатываю распределённые backend-системы, инфраструктуру обмена сообщениями и распределения состояния, WebSocket-сервисы и конвейеры обработки данных с использованием NATS, Redis, PostgreSQL и ClickHouse.</w:t>
-      </w:r>
-    </w:p>
-    <w:p>
-      <w:r>
-        <w:t xml:space="preserve">Отвечаю за полный цикл: от бизнес-требований до архитектуры, реализации, развёртывания и проверки в production. Это включает эксплуатацию сервисов с Kubernetes и Helm, исследование задержек и ограничений ресурсов, а также улучшение производительности на основе трассировки и профилирования.</w:t>
-      </w:r>
-    </w:p>
-    <w:p>
-      <w:r>
-        <w:t xml:space="preserve">В 1inch занимался распределённым управлением состоянием, интеграциями с blockchain RPC, Solidity-контрактами и производительностью в production. В Faraway разрабатывал backend для многопользовательских функций и работал над горизонтально масштабируемыми системами коммуникации в реальном времени и архитектурами обработки больших объёмов данных.</w:t>
-      </w:r>
-    </w:p>
-    <w:p>
-      <w:r>
-        <w:t xml:space="preserve">Предпочитаю самую простую архитектуру, которая отвечает требованиям, с явным учётом компромиссов между надёжностью, производительностью и сложностью эксплуатации. Также работаю с Rust и TypeScript.</w:t>
+        <w:t xml:space="preserve">Старший инженер-программист с 11-летним опытом коммерческой разработки ПО, специализируюсь на Go и проектировании высоконагруженных серверных систем.</w:t>
+      </w:r>
+    </w:p>
+    <w:p>
+      <w:r>
+        <w:t xml:space="preserve">Имею опыт разработки высоконагруженных сервисов и распределённых систем. Участвую в полном цикле разработки: от анализа бизнес-требований и проектирования архитектуры до реализации, развёртывания и сопровождения сервисов в production.</w:t>
+      </w:r>
+    </w:p>
+    <w:p>
+      <w:r>
+        <w:t xml:space="preserve">Основные компетенции:</w:t>
+      </w:r>
+    </w:p>
+    <w:p>
+      <w:r>
+        <w:t xml:space="preserve">Проектирование и разработка backend-сервисов на Go.</w:t>
+      </w:r>
+    </w:p>
+    <w:p>
+      <w:r>
+        <w:t xml:space="preserve">Разработка распределённых систем и взаимодействия между сервисами.</w:t>
+      </w:r>
+    </w:p>
+    <w:p>
+      <w:r>
+        <w:t xml:space="preserve">Проектирование баз данных, оптимизация запросов и производительности.</w:t>
+      </w:r>
+    </w:p>
+    <w:p>
+      <w:r>
+        <w:t xml:space="preserve">Оценка трудозатрат, декомпозиция задач и планирование технических изменений.</w:t>
+      </w:r>
+    </w:p>
+    <w:p>
+      <w:r>
+        <w:t xml:space="preserve">Анализ зависимостей и влияния изменений на существующие компоненты системы.</w:t>
+      </w:r>
+    </w:p>
+    <w:p>
+      <w:r>
+        <w:t xml:space="preserve">Проведение code review с акцентом на корректность, алгоритмическую сложность и соответствие архитектурным требованиям.</w:t>
+      </w:r>
+    </w:p>
+    <w:p>
+      <w:r>
+        <w:t xml:space="preserve">Опыт технического руководства backend-командой.</w:t>
+      </w:r>
+    </w:p>
+    <w:p>
+      <w:r>
+        <w:t xml:space="preserve">При проектировании систем отдаю предпочтение простым и обоснованным архитектурным решениям с учётом требований к надёжности, производительности и сложности сопровождения.</w:t>
+      </w:r>
+    </w:p>
+    <w:p>
+      <w:r>
+        <w:t xml:space="preserve">Технологический стек:</w:t>
+      </w:r>
+    </w:p>
+    <w:p>
+      <w:r>
+        <w:t xml:space="preserve">Go, TypeScript, NodeJS, Tempo, Pyroscope, PostgreSQL, Redis, NATS, gRPC, Docker, Kubernetes, Prometheus, Grafana, Kafka, RabbitMQ, ClickHouse.</w:t>
+      </w:r>
+    </w:p>
+    <w:p>
+      <w:r>
+        <w:t xml:space="preserve">Дополнительный опыт:</w:t>
+      </w:r>
+    </w:p>
+    <w:p>
+      <w:r>
+        <w:t xml:space="preserve">Разрабатываю Onepiece, модульный инструмент для автоматизации инженерных процессов с использованием ИИ. Также работаю с Rust и TypeScript. Более 10 лет занимаюсь реверс-инжинирингом сетевых протоколов MMORPG.</w:t>
       </w:r>
     </w:p>
     <w:p>
@@ -114,37 +164,47 @@
     </w:p>
     <w:p>
       <w:r>
-        <w:t xml:space="preserve">• Интегрировал новые DEX-протоколы в Pathfinder, расширяя покрытие торговых пар и улучшая доступные курсы обмена.</w:t>
-      </w:r>
-    </w:p>
-    <w:p>
-      <w:r>
-        <w:t xml:space="preserve">• Поддерживал интеграции при изменениях API и адресов контрактов, взаимодействовал с разработчиками DEX-протоколов.</w:t>
-      </w:r>
-    </w:p>
-    <w:p>
-      <w:r>
-        <w:t xml:space="preserve">• Анализировал обращения поддержки и production-инциденты, связанные с маршрутизацией и интеграциями протоколов.</w:t>
-      </w:r>
-    </w:p>
-    <w:p>
-      <w:r>
-        <w:t xml:space="preserve">• Разрабатывал интеграционные тесты для реальных сценариев обмена, используя Tenderly и blockchain RPC-провайдеров.</w:t>
-      </w:r>
-    </w:p>
-    <w:p>
-      <w:r>
-        <w:t xml:space="preserve">• Проектировал и поддерживал процессы развёртывания сервисов в staging и production.</w:t>
-      </w:r>
-    </w:p>
-    <w:p>
-      <w:r>
-        <w:t xml:space="preserve">• Участвовал в архитектуре новых функций и миграции с HTTP на NATS, упростив горизонтальное масштабирование сервисов.</w:t>
-      </w:r>
-    </w:p>
-    <w:p>
-      <w:r>
-        <w:t xml:space="preserve">• Технологии: Golang, Typescript, NATS, Redis, Blockchain, gRPC, Protobuf, Clickhouse</w:t>
+        <w:t xml:space="preserve">• Инициировал и спроектировал миграцию межсервисного взаимодействия с HTTP на NATS, чтобы упростить оркестрацию сервисов и горизонтальное масштабирование в нескольких регионах AWS.</w:t>
+      </w:r>
+    </w:p>
+    <w:p>
+      <w:r>
+        <w:t xml:space="preserve">• Совместно с DevOps-командой спроектировал мультирегиональную топологию NATS с независимыми региональными кластерами, связанными через leaf nodes.</w:t>
+      </w:r>
+    </w:p>
+    <w:p>
+      <w:r>
+        <w:t xml:space="preserve">• Спроектировал и реализовал Go-библиотеку для межсервисного взаимодействия с использованием NATS request/reply и queue groups. Реализовал механизмы backpressure на уровне воркеров, классификацию запросов по вычислительной сложности и обработку ACK/NACK на уровне приложения с повторными попытками на стороне клиента для перераспределения запросов под нагрузкой.</w:t>
+      </w:r>
+    </w:p>
+    <w:p>
+      <w:r>
+        <w:t xml:space="preserve">• Разрабатывал и поддерживал интеграции DEX-протоколов в Pathfinder, сервисе маршрутизации обменов, расширяя покрытие ликвидности и доступные маршруты обмена для улучшения вариантов исполнения сделок.</w:t>
+      </w:r>
+    </w:p>
+    <w:p>
+      <w:r>
+        <w:t xml:space="preserve">• Адаптировал интеграции к изменениям внешних API и смарт-контрактов, взаимодействовал с командами DEX-протоколов для исследования и устранения проблем совместимости.</w:t>
+      </w:r>
+    </w:p>
+    <w:p>
+      <w:r>
+        <w:t xml:space="preserve">• Исследовал и устранял production-инциденты, связанные с маршрутизацией обменов, взаимодействием с блокчейнами и интеграциями внешних протоколов. Разрабатывал интеграционные тесты для реальных сценариев обмена с использованием Tenderly и blockchain RPC-провайдеров.</w:t>
+      </w:r>
+    </w:p>
+    <w:p>
+      <w:r>
+        <w:t xml:space="preserve">• Проектировал и поддерживал процессы развёртывания backend-сервисов в staging и production.</w:t>
+      </w:r>
+    </w:p>
+    <w:p>
+      <w:r>
+        <w:t xml:space="preserve">• Участвую в интеграции новых блокчейнов, таких как Solana и Robinhood.</w:t>
+      </w:r>
+    </w:p>
+    <w:p>
+      <w:r>
+        <w:t xml:space="preserve">• Технологии: Go, TypeScript, NATS, Redis, gRPC, Protobuf, ClickHouse, AWS, Blockchain, Tenderly, RPC.</w:t>
       </w:r>
     </w:p>
     <w:p>
@@ -258,7 +318,7 @@
     </w:p>
     <w:p>
       <w:r>
-        <w:t xml:space="preserve">• Улучшал архитектуру и проводил рефакторинг существующих систем.</w:t>
+        <w:t xml:space="preserve">• Улучшал архитектуру и проводил рефакторинг существующих backend-систем.</w:t>
       </w:r>
     </w:p>
     <w:p>
@@ -519,7 +579,7 @@
     </w:p>
     <w:p>
       <w:r>
-        <w:t xml:space="preserve">Scrum Developer Certificate</w:t>
+        <w:t xml:space="preserve">Professional Scrum Developer 1</w:t>
       </w:r>
     </w:p>
     <w:p>

</xml_diff>

<commit_message>
Keep professional and work experience titles in English on Russian resume
</commit_message>
<xml_diff>
--- a/grigorii-eleskin-resume-ru.docx
+++ b/grigorii-eleskin-resume-ru.docx
@@ -12,7 +12,7 @@
     </w:p>
     <w:p>
       <w:r>
-        <w:t xml:space="preserve">Старший инженер-программист</w:t>
+        <w:t xml:space="preserve">Senior Software Engineer</w:t>
       </w:r>
     </w:p>
     <w:p>
@@ -154,7 +154,7 @@
     </w:p>
     <w:p>
       <w:r>
-        <w:t xml:space="preserve">Старший backend-инженер</w:t>
+        <w:t xml:space="preserve">Senior Backend Engineer</w:t>
       </w:r>
     </w:p>
     <w:p>
@@ -217,7 +217,7 @@
     </w:p>
     <w:p>
       <w:r>
-        <w:t xml:space="preserve">Старший Go-разработчик</w:t>
+        <w:t xml:space="preserve">Senior Golang Developer</w:t>
       </w:r>
     </w:p>
     <w:p>
@@ -265,7 +265,7 @@
     </w:p>
     <w:p>
       <w:r>
-        <w:t xml:space="preserve">Старший Go-разработчик</w:t>
+        <w:t xml:space="preserve">Senior Golang Developer</w:t>
       </w:r>
     </w:p>
     <w:p>
@@ -298,7 +298,7 @@
     </w:p>
     <w:p>
       <w:r>
-        <w:t xml:space="preserve">Технический руководитель команды</w:t>
+        <w:t xml:space="preserve">Technical Team Lead</w:t>
       </w:r>
     </w:p>
     <w:p>
@@ -331,7 +331,7 @@
     </w:p>
     <w:p>
       <w:r>
-        <w:t xml:space="preserve">Backend-разработчик</w:t>
+        <w:t xml:space="preserve">Backend Developer</w:t>
       </w:r>
     </w:p>
     <w:p>
@@ -364,7 +364,7 @@
     </w:p>
     <w:p>
       <w:r>
-        <w:t xml:space="preserve">Инженер-программист</w:t>
+        <w:t xml:space="preserve">Software Engineer</w:t>
       </w:r>
     </w:p>
     <w:p>
@@ -387,7 +387,7 @@
     </w:p>
     <w:p>
       <w:r>
-        <w:t xml:space="preserve">Go-разработчик (Middle)</w:t>
+        <w:t xml:space="preserve">Middle Golang Developer</w:t>
       </w:r>
     </w:p>
     <w:p>
@@ -410,7 +410,7 @@
     </w:p>
     <w:p>
       <w:r>
-        <w:t xml:space="preserve">Go-разработчик (Middle)</w:t>
+        <w:t xml:space="preserve">Middle Golang Developer</w:t>
       </w:r>
     </w:p>
     <w:p>

</xml_diff>

<commit_message>
Add 1inch impact showcase to English and Russian resumes
</commit_message>
<xml_diff>
--- a/grigorii-eleskin-resume-ru.docx
+++ b/grigorii-eleskin-resume-ru.docx
@@ -336,6 +336,49 @@
     <w:p>
       <w:r>
         <w:t xml:space="preserve">• Разрабатываю CLI на Go для взаимодействия с сервисом Iron, реализую команды и улучшаю рабочие процессы в командной строке.</w:t>
+      </w:r>
+    </w:p>
+    <w:p>
+      <w:pPr>
+        <w:pStyle w:val="Heading1"/>
+      </w:pPr>
+      <w:r>
+        <w:t xml:space="preserve">Результаты работы — кейс 1inch</w:t>
+      </w:r>
+    </w:p>
+    <w:p>
+      <w:r>
+        <w:t xml:space="preserve">Один из самых быстрых измеримых результатов, которых я добился по своей инициативе, — создание системы анализа конкурентных котировок в 1inch: весь проект от начала до запуска был реализован всего за две недели.</w:t>
+      </w:r>
+    </w:p>
+    <w:p>
+      <w:r>
+        <w:t xml:space="preserve">Идея возникла из бизнес-задачи: понять, в каких случаях наш алгоритм маршрутизации обменов проигрывал конкурентам. Прямолинейный подход потребовал бы создания масштабной инфраструктуры для непрерывного получения on-chain котировок по тысячам торговых пар у нескольких агрегаторов. Вместо этого я предложил использовать Matcha, который уже объединял котировки от нескольких провайдеров, чтобы быстрее проверить идею и получить полезный результат.</w:t>
+      </w:r>
+    </w:p>
+    <w:p>
+      <w:r>
+        <w:t xml:space="preserve">Главной сложностью было обеспечить надёжный сбор данных, несмотря на сложные механизмы идентификации браузера (browser fingerprinting), антибот-защиту и ограничения частоты запросов. Я использовал локальные LLM с открытым исходным кодом, чтобы ускорить обратную разработку и эксперименты, а AI-агенты для написания кода помогли устранить значительную часть рутинной работы по реализации.</w:t>
+      </w:r>
+    </w:p>
+    <w:p>
+      <w:r>
+        <w:t xml:space="preserve">За две недели я разработал и запустил всю систему: автоматизированный сбор котировок, аналитический пайплайн на ClickHouse и дашборд для сравнения 1inch с конкурентами примерно в 15 блокчейн-сетях и по более чем 3 000 торговых пар. Данные собирались каждую секунду.</w:t>
+      </w:r>
+    </w:p>
+    <w:p>
+      <w:r>
+        <w:t xml:space="preserve">Эффект для бизнеса вышел за рамки мониторинга. Мы могли находить исторические случаи, в которых наш алгоритм маршрутизации показывал худший результат, воспроизводить их на конкретных состояниях блокчейна и определять причину: отсутствие поддержки протоколов или неэффективность маршрутизации. Эти выводы помогали расставлять приоритеты для новых интеграций протоколов и улучшений алгоритма. За следующие две недели доля сравнений, в которых мы выигрывали у конкурентов, выросла примерно с 40–45% до 55% — по оценке, на 10–15 процентных пунктов.</w:t>
+      </w:r>
+    </w:p>
+    <w:p>
+      <w:r>
+        <w:t xml:space="preserve">Главный вывод для меня: простая и прагматичная идея может быстро вырасти в гораздо более мощную систему. Локальные AI-модели и агенты для написания кода значительно ускорили исследования и реализацию, позволив мне сосредоточиться на архитектуре, экспериментах и пользе для бизнеса вместо повторяющихся задач.</w:t>
+      </w:r>
+    </w:p>
+    <w:p>
+      <w:r>
+        <w:t xml:space="preserve">Оглядываясь назад, я бы параллельно начал создавать независимый пайплайн сбора on-chain котировок. Это снизило бы нашу зависимость от единственного внешнего источника данных, устранило потенциальную единую точку отказа и дало дополнительный способ проверять точность сравнений с конкурентами.</w:t>
       </w:r>
     </w:p>
     <w:sectPr>

</xml_diff>